<commit_message>
Revise first knowledge check and printable copies
</commit_message>
<xml_diff>
--- a/print-ready/Knowledge-Check-1-Key.docx
+++ b/print-ready/Knowledge-Check-1-Key.docx
@@ -294,7 +294,7 @@
                 <w:color w:val="1F1F1F"/>
                 <w:sz w:val="20"/>
               </w:rPr>
-              <w:t>B</w:t>
+              <w:t>A</w:t>
             </w:r>
           </w:p>
         </w:tc>
@@ -321,7 +321,7 @@
                 <w:color w:val="1F1F1F"/>
                 <w:sz w:val="20"/>
               </w:rPr>
-              <w:t>False</w:t>
+              <w:t>The West has the larger target audience; the South has the higher target-audience percentage.</w:t>
             </w:r>
           </w:p>
         </w:tc>
@@ -380,7 +380,7 @@
                 <w:color w:val="1F1F1F"/>
                 <w:sz w:val="20"/>
               </w:rPr>
-              <w:t>A</w:t>
+              <w:t>B</w:t>
             </w:r>
           </w:p>
         </w:tc>
@@ -407,7 +407,7 @@
                 <w:color w:val="1F1F1F"/>
                 <w:sz w:val="20"/>
               </w:rPr>
-              <w:t>True</w:t>
+              <w:t>Four rows, with one average income for each region.</w:t>
             </w:r>
           </w:p>
         </w:tc>
@@ -552,7 +552,7 @@
                 <w:color w:val="1F1F1F"/>
                 <w:sz w:val="20"/>
               </w:rPr>
-              <w:t>B</w:t>
+              <w:t>A</w:t>
             </w:r>
           </w:p>
         </w:tc>
@@ -579,7 +579,7 @@
                 <w:color w:val="1F1F1F"/>
                 <w:sz w:val="20"/>
               </w:rPr>
-              <w:t>False</w:t>
+              <w:t>Left join the activity table onto the customer table using `customer_id`.</w:t>
             </w:r>
           </w:p>
         </w:tc>
@@ -665,7 +665,7 @@
                 <w:color w:val="1F1F1F"/>
                 <w:sz w:val="20"/>
               </w:rPr>
-              <w:t>arguments</w:t>
+              <w:t>Side-by-side boxplots of individual customer incomes by region.</w:t>
             </w:r>
           </w:p>
         </w:tc>
@@ -1525,7 +1525,7 @@
                 <w:color w:val="1F1F1F"/>
                 <w:sz w:val="20"/>
               </w:rPr>
-              <w:t>## Question 1</w:t>
+              <w:t>As categories, using a character or factor column, because ZIP codes identify groups.</w:t>
             </w:r>
           </w:p>
         </w:tc>
@@ -1584,7 +1584,7 @@
                 <w:color w:val="1F1F1F"/>
                 <w:sz w:val="20"/>
               </w:rPr>
-              <w:t>B</w:t>
+              <w:t>A</w:t>
             </w:r>
           </w:p>
         </w:tc>
@@ -1611,7 +1611,7 @@
                 <w:color w:val="1F1F1F"/>
                 <w:sz w:val="20"/>
               </w:rPr>
-              <w:t>False</w:t>
+              <w:t>True</w:t>
             </w:r>
           </w:p>
         </w:tc>

</xml_diff>